<commit_message>
Add Woodall et al. 2023 FIGSS national precedent (Woodall feedback) + Supporting Information
- Cite FIGSS (FEM 546:121361) in Comment and manuscript as national precedent for the
  multi-axis treatment of MOG and its definitional sensitivity (27-81% federal forest)
- Add standalone Supporting Information: manuscript SI (Tables S1-S10), Comment SI
  (reproduction, rebalancing menu, matched-prevalence cross-map), and a main-text-only manuscript
- Fix Table S8 cross-reference; rebuild docx + PDFs
</commit_message>
<xml_diff>
--- a/comment/Ecosphere_Comment_Hagan_FINAL.docx
+++ b/comment/Ecosphere_Comment_Hagan_FINAL.docx
@@ -90,7 +90,7 @@
           <w:i w:val="false"/>
           <w:iCs w:val="false"/>
         </w:rPr>
-        <w:t xml:space="preserve">Mapping late-successional and old-growth (LSOG) forest has become a national undertaking. A 2022 federal executive order directed the first government-wide inventory of mature and old-growth forest (U.S. Executive Order 14072 2022; USDA Forest Service and USDI Bureau of Land Management 2023), and in the same period continental old-growth probability layers (Bruening et al. 2026), structure-based national maps (DellaSala et al. 2022), region-standardized field criteria (Pelz et al. 2023), and global canopy-height products (Potapov et al. 2021) were all produced. A recurring lesson runs through that body of work: because older forest is rare, structurally heterogeneous, and operationalized differently by each program, independent and individually credible maps disagree substantially on both how much LSOG exists and where it sits, and defining the condition at all is a recognized hard problem (Barnett et al. 2023; Gray et al. 2023). That disagreement, more than any single map's internal error, is what makes a map's fitness for a particular decision the question that matters. The maps also carry consequences once they are read literally, because a wall-to-wall surface is easily taken as a direct guide to where conservation money should go, stripped of the caveats and uncertainties under which it was built. Maine offers an unusually concrete instance of that general problem, and we treat it here not as a special case but as a worked example of what a cross-map accuracy assessment and an explicit uncertainty statement add before a map anchors spending.</w:t>
+        <w:t xml:space="preserve">Mapping late-successional and old-growth (LSOG) forest has become a national undertaking. A 2022 federal executive order directed the first government-wide inventory of mature and old-growth forest (U.S. Executive Order 14072 2022; USDA Forest Service and USDI Bureau of Land Management 2023), and in the same period continental old-growth probability layers (Bruening et al. 2026), structure-based national maps (DellaSala et al. 2022), region-standardized field criteria (Pelz et al. 2023), and global canopy-height products (Potapov et al. 2021) were all produced. A recurring lesson runs through that body of work: because older forest is rare, structurally heterogeneous, and operationalized differently by each program, independent and individually credible maps disagree substantially on both how much LSOG exists and where it sits, and defining the condition at all is a recognized hard problem (Barnett et al. 2023; Gray et al. 2023). That federal effort has also shown that treating maturity and old growth as a multidimensional structural condition rather than a single threshold leaves the estimate strongly dependent on the criteria chosen: the Forest Inventory Growth Stage System places on the order of 27% to 81% of federal forest in the mature class depending on the percentile and index used (Woodall et al. 2023), the national-scale analogue of the definitional sensitivity we quantify here. That disagreement, more than any single map's internal error, is what makes a map's fitness for a particular decision the question that matters. The maps also carry consequences once they are read literally, because a wall-to-wall surface is easily taken as a direct guide to where conservation money should go, stripped of the caveats and uncertainties under which it was built. Maine offers an unusually concrete instance of that general problem, and we treat it here not as a special case but as a worked example of what a cross-map accuracy assessment and an explicit uncertainty statement add before a map anchors spending.</w:t>
       </w:r>
     </w:p>
     <w:p>
@@ -738,6 +738,19 @@
           <w:szCs w:val="24"/>
         </w:rPr>
         <w:t xml:space="preserve">USDA Forest Service and USDI Bureau of Land Management. 2023. Mature and old-growth forests: definition, identification, and initial inventory on lands managed by the Forest Service and Bureau of Land Management. U.S. Department of Agriculture and U.S. Department of the Interior, Washington, D.C.</w:t>
+      </w:r>
+    </w:p>
+    <w:p>
+      <w:pPr>
+        <w:spacing w:line="480"/>
+        <w:ind w:left="360" w:hanging="360"/>
+      </w:pPr>
+      <w:r>
+        <w:rPr>
+          <w:sz w:val="24"/>
+          <w:szCs w:val="24"/>
+        </w:rPr>
+        <w:t xml:space="preserve">Woodall, C.W., A.G. Kamoske, G.D. Hayward, T.M. Schuler, C.A. Hiemstra, M. Palmer &amp; A.N. Gray. 2023. Classifying mature federal forests in the United States: the forest inventory growth stage system. Forest Ecology and Management 546:121361. https://doi.org/10.1016/j.foreco.2023.121361</w:t>
       </w:r>
     </w:p>
     <w:p>

</xml_diff>

<commit_message>
Add Burrascano et al. 2013 global old-growth structural review (D'Amato feedback)
Cite Burrascano, Keeton, Sabatini & Blasi 2013 (FEM 291:458-479) in Comment and
manuscript where the live-structure axis (large-tree basal area and density) is justified.
</commit_message>
<xml_diff>
--- a/comment/Ecosphere_Comment_Hagan_FINAL.docx
+++ b/comment/Ecosphere_Comment_Hagan_FINAL.docx
@@ -359,7 +359,7 @@
           <w:i w:val="false"/>
           <w:iCs w:val="false"/>
         </w:rPr>
-        <w:t xml:space="preserve">Applying the same multi-axis LSOG definition to the FIA probability sample with design-based estimation gives the disputed quantity directly: under the integrated structural proxy, late-successional-and-old-growth forest covers 14.1% [12.9, 15.3] of Maine forestland (2019–2023 FIA panel, 3,125 plots), and requiring all four structural axes, each on a transparent and deliberately conservative criterion, reduces true LSOG to 3.1% [2.5, 3.7] (Table 4): live large-tree structure (basal area ≥ 30 ft²/ac in trees ≥ 40 cm, about 16 in, dbh), dead wood (standing-dead basal area ≥ 5 ft²/ac), compositional maturity (at least half of live basal area in long-lived late-successional species), and temporal continuity verified from the full Landsat disturbance record. These are lower benchmarks calibrated to regional reference stands rather than maxima, so the qualifying share is a floor on what a stricter definition of large-tree or dead-wood structure would return. The reproduced LiDAR map's 21.9% any-LSOG is the highest of the operational maps and exceeds the design-based any-LSOG estimate of 14.1%. The spaceborne canopy-height map (14.0%) coincides almost exactly with that design-based estimate, so two routes that differ in sensor and method converge near 14% while the airborne map sits well above them; the TreeMap imputation (7.8%) sits below, and the strict four-axis estimate (3.1%) far below. The appropriate reporting unit remains the design-based estimate with its interval, against which the airborne map is the highest of the operational estimates. This ordering reflects a principle rather than a coincidence of these particular numbers. For the amount of LSOG, a design-based estimate from a probability sample is the reference quantity, with a known and quantifiable sampling error, that any wall-to-wall map of the same attribute is obliged to reproduce. When a map departs from that estimate, the discrepancy is a property of the map and not of the inventory, and the burden falls on the map to reconcile with the design-based total rather than the reverse. A map's distinctive contribution is spatial, telling us where that total is most likely to fall; it does not overturn the total itself. The contrary objection, that FIA lacks the resolution to see LSOG and that a wall-to-wall map is therefore required, conflates spatial resolution with statistical resolution of a total. FIA cannot say which hectare is old, but that is the map's task; for how much old forest a region holds, the probability sample is the design-unbiased reference, and rarity widens its interval without biasing its estimate. The federal analysis ran short of plots only because a national stratification spreads them thin; concentrated on Maine, the same sample supplies several thousand plots and bounds even the oldest class (0.7% [0.4, 1.0]). The map does not escape the rarity it is invoked to solve, it conceals it, reporting a rare-class area that is both biased by a non-representative training sample and given without an interval. Tellingly, the published LS+OGL total of 3.9% falls inside the design-based interval [3.3, 4.6]: the inventory resolves the amount, and on that amount the two agree. What remains in dispute is the broader any-LSOG total and the location of LSOG, and a finer-grained but design-biased map is not the instrument that settles either.</w:t>
+        <w:t xml:space="preserve">Applying the same multi-axis LSOG definition to the FIA probability sample with design-based estimation gives the disputed quantity directly: under the integrated structural proxy, late-successional-and-old-growth forest covers 14.1% [12.9, 15.3] of Maine forestland (2019–2023 FIA panel, 3,125 plots), and requiring all four structural axes, each on a transparent and deliberately conservative criterion, reduces true LSOG to 3.1% [2.5, 3.7] (Table 4): live large-tree structure (basal area ≥ 30 ft²/ac in trees ≥ 40 cm, about 16 in, dbh; among the most consistent structural signatures of temperate old growth, Burrascano et al. 2013), dead wood (standing-dead basal area ≥ 5 ft²/ac), compositional maturity (at least half of live basal area in long-lived late-successional species), and temporal continuity verified from the full Landsat disturbance record. These are lower benchmarks calibrated to regional reference stands rather than maxima, so the qualifying share is a floor on what a stricter definition of large-tree or dead-wood structure would return. The reproduced LiDAR map's 21.9% any-LSOG is the highest of the operational maps and exceeds the design-based any-LSOG estimate of 14.1%. The spaceborne canopy-height map (14.0%) coincides almost exactly with that design-based estimate, so two routes that differ in sensor and method converge near 14% while the airborne map sits well above them; the TreeMap imputation (7.8%) sits below, and the strict four-axis estimate (3.1%) far below. The appropriate reporting unit remains the design-based estimate with its interval, against which the airborne map is the highest of the operational estimates. This ordering reflects a principle rather than a coincidence of these particular numbers. For the amount of LSOG, a design-based estimate from a probability sample is the reference quantity, with a known and quantifiable sampling error, that any wall-to-wall map of the same attribute is obliged to reproduce. When a map departs from that estimate, the discrepancy is a property of the map and not of the inventory, and the burden falls on the map to reconcile with the design-based total rather than the reverse. A map's distinctive contribution is spatial, telling us where that total is most likely to fall; it does not overturn the total itself. The contrary objection, that FIA lacks the resolution to see LSOG and that a wall-to-wall map is therefore required, conflates spatial resolution with statistical resolution of a total. FIA cannot say which hectare is old, but that is the map's task; for how much old forest a region holds, the probability sample is the design-unbiased reference, and rarity widens its interval without biasing its estimate. The federal analysis ran short of plots only because a national stratification spreads them thin; concentrated on Maine, the same sample supplies several thousand plots and bounds even the oldest class (0.7% [0.4, 1.0]). The map does not escape the rarity it is invoked to solve, it conceals it, reporting a rare-class area that is both biased by a non-representative training sample and given without an interval. Tellingly, the published LS+OGL total of 3.9% falls inside the design-based interval [3.3, 4.6]: the inventory resolves the amount, and on that amount the two agree. What remains in dispute is the broader any-LSOG total and the location of LSOG, and a finer-grained but design-biased map is not the instrument that settles either.</w:t>
       </w:r>
     </w:p>
     <w:p>
@@ -530,6 +530,19 @@
           <w:szCs w:val="24"/>
         </w:rPr>
         <w:t xml:space="preserve">Bruening, J.M., P.B. May, R.O. Dubayah, L. Wertis, C. Quinn, N. Pederson, A.H. Armstrong &amp; B. Poulter. 2026. Mature and old-growth forest probability maps for the conterminous United States. ORNL DAAC, Oak Ridge, Tennessee, USA. Dataset 2498. https://doi.org/10.3334/ORNLDAAC/2498</w:t>
+      </w:r>
+    </w:p>
+    <w:p>
+      <w:pPr>
+        <w:spacing w:line="480"/>
+        <w:ind w:left="360" w:hanging="360"/>
+      </w:pPr>
+      <w:r>
+        <w:rPr>
+          <w:sz w:val="24"/>
+          <w:szCs w:val="24"/>
+        </w:rPr>
+        <w:t xml:space="preserve">Burrascano, S., W.S. Keeton, F.M. Sabatini &amp; C. Blasi. 2013. Commonality and variability in the structural attributes of moist temperate old-growth forests: a global review. Forest Ecology and Management 291:458-479. https://doi.org/10.1016/j.foreco.2012.11.020</w:t>
       </w:r>
     </w:p>
     <w:p>

</xml_diff>

<commit_message>
Add Woodall-confirmed FIGSS sensitivity (27-81% MOG swing, Woodall et al. 2023 Tables 4-5)
Confirmed by C. Woodall: the 27% to 81% federal MOG swing is Tables 4 and 5
of the FIGSS paper. Added the figure to the manuscript intro and the Comment
national-precedent paragraph; rebuilt manuscript V2/main/SI and Comment FINAL/SI.
</commit_message>
<xml_diff>
--- a/comment/Ecosphere_Comment_Hagan_FINAL.docx
+++ b/comment/Ecosphere_Comment_Hagan_FINAL.docx
@@ -4,6 +4,30 @@
   <w:body>
     <w:p>
       <w:pPr>
+        <w:spacing w:line="300"/>
+      </w:pPr>
+      <w:r>
+        <w:rPr>
+          <w:sz w:val="22"/>
+          <w:szCs w:val="22"/>
+        </w:rPr>
+        <w:t xml:space="preserve">Ecosphere</w:t>
+      </w:r>
+    </w:p>
+    <w:p>
+      <w:pPr>
+        <w:spacing w:after="80" w:line="300"/>
+      </w:pPr>
+      <w:r>
+        <w:rPr>
+          <w:sz w:val="22"/>
+          <w:szCs w:val="22"/>
+        </w:rPr>
+        <w:t xml:space="preserve">Manuscript type: Comment</w:t>
+      </w:r>
+    </w:p>
+    <w:p>
+      <w:pPr>
         <w:spacing w:after="120" w:line="360"/>
       </w:pPr>
       <w:r>
@@ -35,10 +59,85 @@
         </w:rPr>
         <w:t xml:space="preserve">1</w:t>
       </w:r>
-    </w:p>
-    <w:p>
-      <w:pPr>
-        <w:spacing w:after="120" w:line="300"/>
+      <w:r>
+        <w:rPr>
+          <w:sz w:val="24"/>
+          <w:szCs w:val="24"/>
+        </w:rPr>
+        <w:t xml:space="preserve">, Anthony W. D'Amato</w:t>
+      </w:r>
+      <w:r>
+        <w:rPr>
+          <w:sz w:val="16"/>
+          <w:szCs w:val="16"/>
+          <w:vertAlign w:val="superscript"/>
+        </w:rPr>
+        <w:t xml:space="preserve">2</w:t>
+      </w:r>
+      <w:r>
+        <w:rPr>
+          <w:sz w:val="24"/>
+          <w:szCs w:val="24"/>
+        </w:rPr>
+        <w:t xml:space="preserve">, Christopher W. Woodall</w:t>
+      </w:r>
+      <w:r>
+        <w:rPr>
+          <w:sz w:val="16"/>
+          <w:szCs w:val="16"/>
+          <w:vertAlign w:val="superscript"/>
+        </w:rPr>
+        <w:t xml:space="preserve">3</w:t>
+      </w:r>
+      <w:r>
+        <w:rPr>
+          <w:sz w:val="24"/>
+          <w:szCs w:val="24"/>
+        </w:rPr>
+        <w:t xml:space="preserve">, Erin Simons-Legaard</w:t>
+      </w:r>
+      <w:r>
+        <w:rPr>
+          <w:sz w:val="16"/>
+          <w:szCs w:val="16"/>
+          <w:vertAlign w:val="superscript"/>
+        </w:rPr>
+        <w:t xml:space="preserve">1</w:t>
+      </w:r>
+      <w:r>
+        <w:rPr>
+          <w:sz w:val="24"/>
+          <w:szCs w:val="24"/>
+        </w:rPr>
+        <w:t xml:space="preserve">, Adam Daigneault</w:t>
+      </w:r>
+      <w:r>
+        <w:rPr>
+          <w:sz w:val="16"/>
+          <w:szCs w:val="16"/>
+          <w:vertAlign w:val="superscript"/>
+        </w:rPr>
+        <w:t xml:space="preserve">1</w:t>
+      </w:r>
+      <w:r>
+        <w:rPr>
+          <w:sz w:val="24"/>
+          <w:szCs w:val="24"/>
+        </w:rPr>
+        <w:t xml:space="preserve">, Daniel J. Hayes</w:t>
+      </w:r>
+      <w:r>
+        <w:rPr>
+          <w:sz w:val="16"/>
+          <w:szCs w:val="16"/>
+          <w:vertAlign w:val="superscript"/>
+        </w:rPr>
+        <w:t xml:space="preserve">1</w:t>
+      </w:r>
+    </w:p>
+    <w:p>
+      <w:pPr>
+        <w:spacing w:line="300"/>
       </w:pPr>
       <w:r>
         <w:rPr>
@@ -47,12 +146,12 @@
           <w:sz w:val="20"/>
           <w:szCs w:val="20"/>
         </w:rPr>
-        <w:t xml:space="preserve">1 University of Maine, Center for Research on Sustainable Forests, 5755 Nutting Hall, Orono, ME 04469, USA. aaron.weiskittel@maine.edu</w:t>
-      </w:r>
-    </w:p>
-    <w:p>
-      <w:pPr>
-        <w:spacing w:after="120" w:line="300"/>
+        <w:t xml:space="preserve">1 University of Maine, Center for Research on Sustainable Forests and School of Forest Resources, 5755 Nutting Hall, Orono, ME 04469, USA</w:t>
+      </w:r>
+    </w:p>
+    <w:p>
+      <w:pPr>
+        <w:spacing w:line="300"/>
       </w:pPr>
       <w:r>
         <w:rPr>
@@ -61,7 +160,70 @@
           <w:sz w:val="20"/>
           <w:szCs w:val="20"/>
         </w:rPr>
+        <w:t xml:space="preserve">2 University of Vermont, Rubenstein School of Environment and Natural Resources, Burlington, VT, USA</w:t>
+      </w:r>
+    </w:p>
+    <w:p>
+      <w:pPr>
+        <w:spacing w:line="300"/>
+      </w:pPr>
+      <w:r>
+        <w:rPr>
+          <w:i/>
+          <w:iCs/>
+          <w:sz w:val="20"/>
+          <w:szCs w:val="20"/>
+        </w:rPr>
+        <w:t xml:space="preserve">3 CTrees, Pasadena, CA, USA</w:t>
+      </w:r>
+    </w:p>
+    <w:p>
+      <w:pPr>
+        <w:spacing w:after="120" w:line="300"/>
+      </w:pPr>
+      <w:r>
+        <w:rPr>
+          <w:i/>
+          <w:iCs/>
+          <w:sz w:val="20"/>
+          <w:szCs w:val="20"/>
+        </w:rPr>
+        <w:t xml:space="preserve">Corresponding author: Aaron R. Weiskittel, aaron.weiskittel@maine.edu</w:t>
+      </w:r>
+    </w:p>
+    <w:p>
+      <w:pPr>
+        <w:spacing w:after="120" w:line="300"/>
+      </w:pPr>
+      <w:r>
+        <w:rPr>
+          <w:i/>
+          <w:iCs/>
+          <w:sz w:val="20"/>
+          <w:szCs w:val="20"/>
+        </w:rPr>
         <w:t xml:space="preserve">Comment on Hagan, J.M., B. Shamgochian, M.M.L. Taylor &amp; J.M. Reed. 2026. Using LiDAR to quantify, map, and conserve late-successional and old-growth forest in Maine, USA. Ecosphere 17(6):e70670. https://doi.org/10.1002/ecs2.70670.</w:t>
+      </w:r>
+    </w:p>
+    <w:p>
+      <w:pPr>
+        <w:spacing w:after="120" w:line="300"/>
+      </w:pPr>
+      <w:r>
+        <w:rPr>
+          <w:b/>
+          <w:bCs/>
+          <w:sz w:val="20"/>
+          <w:szCs w:val="20"/>
+        </w:rPr>
+        <w:t xml:space="preserve">Key words: </w:t>
+      </w:r>
+      <w:r>
+        <w:rPr>
+          <w:sz w:val="20"/>
+          <w:szCs w:val="20"/>
+        </w:rPr>
+        <w:t xml:space="preserve">canopy height; cross-map assessment; design-based estimation; forest inventory and analysis; late-successional and old-growth; map uncertainty; old-growth forest; remote sensing</w:t>
       </w:r>
     </w:p>
     <w:p>
@@ -90,7 +252,7 @@
           <w:i w:val="false"/>
           <w:iCs w:val="false"/>
         </w:rPr>
-        <w:t xml:space="preserve">Mapping late-successional and old-growth (LSOG) forest has become a national undertaking. A 2022 federal executive order directed the first government-wide inventory of mature and old-growth forest (U.S. Executive Order 14072 2022; USDA Forest Service and USDI Bureau of Land Management 2023), and in the same period continental old-growth probability layers (Bruening et al. 2026), structure-based national maps (DellaSala et al. 2022), region-standardized field criteria (Pelz et al. 2023), and global canopy-height products (Potapov et al. 2021) were all produced. A recurring lesson runs through that body of work: because older forest is rare, structurally heterogeneous, and operationalized differently by each program, independent and individually credible maps disagree substantially on both how much LSOG exists and where it sits, and defining the condition at all is a recognized hard problem (Barnett et al. 2023; Gray et al. 2023). That federal effort has also shown that treating maturity and old growth as a multidimensional structural condition rather than a single threshold leaves the estimate strongly dependent on the criteria chosen: the Forest Inventory Growth Stage System builds maturity from a suite of structural indicators across roughly 80 regional vegetation types and places about 45% of federal forest in the mature class and 18% in old growth (Woodall et al. 2023; USDA Forest Service and USDI Bureau of Land Management 2023), an estimate that shifts with the structural thresholds chosen, the national-scale analogue of the definitional sensitivity we quantify here. That disagreement, more than any single map's internal error, is what makes a map's fitness for a particular decision the question that matters. The maps also carry consequences once they are read literally, because a wall-to-wall surface is easily taken as a direct guide to where conservation money should go, stripped of the caveats and uncertainties under which it was built. Maine offers an unusually concrete instance of that general problem, and we treat it here not as a special case but as a worked example of what a cross-map accuracy assessment and an explicit uncertainty statement add before a map anchors spending.</w:t>
+        <w:t xml:space="preserve">Mapping late-successional and old-growth (LSOG) forest has become a national undertaking. A 2022 federal executive order directed the first government-wide inventory of mature and old-growth forest (U.S. Executive Order 14072 2022; USDA Forest Service and USDI Bureau of Land Management 2023), and in the same period continental old-growth probability layers (Bruening et al. 2026), structure-based national maps (DellaSala et al. 2022), region-standardized field criteria (Pelz et al. 2023), and global canopy-height products (Potapov et al. 2021) were all produced. A recurring lesson runs through that body of work: because older forest is rare, structurally heterogeneous, and operationalized differently by each program, independent and individually credible maps disagree substantially on both how much LSOG exists and where it sits, and defining the condition at all is a recognized hard problem (Barnett et al. 2023; Gray et al. 2023). That federal effort has also shown that treating maturity and old growth as a multidimensional structural condition rather than a single threshold leaves the estimate strongly dependent on the criteria chosen: the Forest Inventory Growth Stage System builds maturity from a suite of structural indicators across roughly 80 regional vegetation types and places about 45% of federal forest in the mature class and 18% in old growth (Woodall et al. 2023, their Tables 4 and 5; USDA Forest Service and USDI Bureau of Land Management 2023); in that system the mature-and-old-growth share swings from roughly 27% to 81% of forest depending on the structural thresholds chosen, the national-scale analogue of the definitional sensitivity we quantify here. That disagreement, more than any single map's internal error, is what makes a map's fitness for a particular decision the question that matters. The maps also carry consequences once they are read literally, because a wall-to-wall surface is easily taken as a direct guide to where conservation money should go, stripped of the caveats and uncertainties under which it was built. Maine offers an unusually concrete instance of that general problem, and we treat it here not as a special case but as a worked example of what a cross-map accuracy assessment and an explicit uncertainty statement add before a map anchors spending.</w:t>
       </w:r>
     </w:p>
     <w:p>
@@ -432,7 +594,7 @@
           <w:sz w:val="24"/>
           <w:szCs w:val="24"/>
         </w:rPr>
-        <w:t xml:space="preserve">Competing Interests</w:t>
+        <w:t xml:space="preserve">Acknowledgments</w:t>
       </w:r>
     </w:p>
     <w:p>
@@ -447,7 +609,7 @@
           <w:i w:val="false"/>
           <w:iCs w:val="false"/>
         </w:rPr>
-        <w:t xml:space="preserve">The authors are developing an independent, FIA-anchored multi-axis LSOG classification (the companion analysis referenced here), which could be regarded as an alternative to the product discussed. This Comment is offered as a methodological critique in that context, and all supporting analyses use the original authors' archived data and public data over the same area. The alternative we are developing is held to the same standard we apply here: it equally requires independent field validation of the old-growth class, and our own analyses indicate that even modern wall-to-wall products fall short of replacing design-based estimation for this target: an open Sentinel-based satellite-embedding model reaches a cross-validated area-under-curve near 0.82, and fusing multiple modern sources lifts it to about 0.87, both well above a single coarse canopy-height layer (about 0.67 to 0.70) yet still imperfect for a class this rare; these benchmarks are documented in the companion technical report (Weiskittel 2026). The argument is therefore not that one map outperforms another, but that no remote-sensing map, ours included, can substitute for design-based estimation of how much LSOG exists.</w:t>
+        <w:t xml:space="preserve">We thank the Maine Natural Areas Program and The Nature Conservancy, and Baxter State Park, for access to the ecological reserve and continuous forest inventory data used as independent validation, each provided under data-use agreement. We thank J.M. Hagan and colleagues for openly archiving the training data and code that made the reproduction possible. This work was supported by the Center for Research on Sustainable Forests at the University of Maine [PLACEHOLDER: award numbers].</w:t>
       </w:r>
     </w:p>
     <w:p>
@@ -461,7 +623,7 @@
           <w:sz w:val="24"/>
           <w:szCs w:val="24"/>
         </w:rPr>
-        <w:t xml:space="preserve">Data and Code Availability</w:t>
+        <w:t xml:space="preserve">Author Contributions</w:t>
       </w:r>
     </w:p>
     <w:p>
@@ -476,7 +638,7 @@
           <w:i w:val="false"/>
           <w:iCs w:val="false"/>
         </w:rPr>
-        <w:t xml:space="preserve">All analyses, code, and derived products supporting this Comment are archived at Zenodo (concept DOI 10.5281/zenodo.20614496, resolving to the latest version). Hagan et al.'s training data and code are at Zenodo (10.5281/zenodo.19696494). FIA data are from the USDA FIA DataMart (apps.fs.usda.gov/fia/datamart), accessed June 2026.</w:t>
+        <w:t xml:space="preserve">A.R.W. conceived the Comment, performed the analyses, and wrote the manuscript. A.W.D., C.W.W., E.S.L., A.D., and D.J.H. contributed to interpretation and manuscript revision. All authors approved the final version. [PLACEHOLDER: confirm per-author CRediT roles.]</w:t>
       </w:r>
     </w:p>
     <w:p>
@@ -490,7 +652,65 @@
           <w:sz w:val="24"/>
           <w:szCs w:val="24"/>
         </w:rPr>
-        <w:t xml:space="preserve">Literature Cited</w:t>
+        <w:t xml:space="preserve">Conflict of Interest</w:t>
+      </w:r>
+    </w:p>
+    <w:p>
+      <w:pPr>
+        <w:spacing w:after="0" w:line="480"/>
+        <w:jc w:val="left"/>
+      </w:pPr>
+      <w:r>
+        <w:rPr>
+          <w:b w:val="false"/>
+          <w:bCs w:val="false"/>
+          <w:i w:val="false"/>
+          <w:iCs w:val="false"/>
+        </w:rPr>
+        <w:t xml:space="preserve">The authors are developing an independent, FIA-anchored multi-axis LSOG classification (the companion analysis referenced here), which could be regarded as an alternative to the product discussed. This Comment is offered as a methodological critique in that context, and all supporting analyses use the original authors' archived data and public data over the same area. The alternative we are developing is held to the same standard we apply here: it equally requires independent field validation of the old-growth class, and our own analyses indicate that even modern wall-to-wall products fall short of replacing design-based estimation for this target: an open Sentinel-based satellite-embedding model reaches a cross-validated area-under-curve near 0.82, and fusing multiple modern sources lifts it to about 0.87, both well above a single coarse canopy-height layer (about 0.67 to 0.70) yet still imperfect for a class this rare; these benchmarks are documented in the companion technical report (Weiskittel 2026). The argument is therefore not that one map outperforms another, but that no remote-sensing map, ours included, can substitute for design-based estimation of how much LSOG exists.</w:t>
+      </w:r>
+    </w:p>
+    <w:p>
+      <w:pPr>
+        <w:spacing w:after="60" w:before="240" w:line="480"/>
+      </w:pPr>
+      <w:r>
+        <w:rPr>
+          <w:b/>
+          <w:bCs/>
+          <w:sz w:val="24"/>
+          <w:szCs w:val="24"/>
+        </w:rPr>
+        <w:t xml:space="preserve">Open Research</w:t>
+      </w:r>
+    </w:p>
+    <w:p>
+      <w:pPr>
+        <w:spacing w:after="0" w:line="480"/>
+        <w:jc w:val="left"/>
+      </w:pPr>
+      <w:r>
+        <w:rPr>
+          <w:b w:val="false"/>
+          <w:bCs w:val="false"/>
+          <w:i w:val="false"/>
+          <w:iCs w:val="false"/>
+        </w:rPr>
+        <w:t xml:space="preserve">All analyses, code, and derived products supporting this Comment are archived at Zenodo (concept DOI 10.5281/zenodo.20614496, resolving to the latest version). Hagan et al.'s training data and code are at Zenodo (10.5281/zenodo.19696494). FIA data are from the USDA FIA DataMart (apps.fs.usda.gov/fia/datamart), accessed June 2026. FIA plot coordinates are confidential and are not released.</w:t>
+      </w:r>
+    </w:p>
+    <w:p>
+      <w:pPr>
+        <w:spacing w:after="60" w:before="240" w:line="480"/>
+      </w:pPr>
+      <w:r>
+        <w:rPr>
+          <w:b/>
+          <w:bCs/>
+          <w:sz w:val="24"/>
+          <w:szCs w:val="24"/>
+        </w:rPr>
+        <w:t xml:space="preserve">References</w:t>
       </w:r>
     </w:p>
     <w:p>
@@ -3449,71 +3669,6 @@
             <wp:extent cx="4210050" cy="2457450"/>
             <wp:effectExtent t="0" r="0" b="0" l="0"/>
             <wp:docPr id="1" name="Fig1.png" descr="Fig1.png" title="Fig1.png"/>
-            <wp:cNvGraphicFramePr>
-              <a:graphicFrameLocks xmlns:a="http://schemas.openxmlformats.org/drawingml/2006/main" noChangeAspect="1"/>
-            </wp:cNvGraphicFramePr>
-            <a:graphic xmlns:a="http://schemas.openxmlformats.org/drawingml/2006/main">
-              <a:graphicData uri="http://schemas.openxmlformats.org/drawingml/2006/picture">
-                <pic:pic xmlns:pic="http://schemas.openxmlformats.org/drawingml/2006/picture">
-                  <pic:nvPicPr>
-                    <pic:cNvPr id="0" name="" descr=""/>
-                    <pic:cNvPicPr>
-                      <a:picLocks noChangeAspect="1" noChangeArrowheads="1"/>
-                    </pic:cNvPicPr>
-                  </pic:nvPicPr>
-                  <pic:blipFill>
-                    <a:blip r:embed="rId7" cstate="none"/>
-                    <a:srcRect/>
-                    <a:stretch>
-                      <a:fillRect/>
-                    </a:stretch>
-                  </pic:blipFill>
-                  <pic:spPr bwMode="auto">
-                    <a:xfrm>
-                      <a:off x="0" y="0"/>
-                      <a:ext cx="4210050" cy="2457450"/>
-                    </a:xfrm>
-                    <a:prstGeom prst="rect">
-                      <a:avLst/>
-                    </a:prstGeom>
-                  </pic:spPr>
-                </pic:pic>
-              </a:graphicData>
-            </a:graphic>
-          </wp:inline>
-        </w:drawing>
-      </w:r>
-    </w:p>
-    <w:p>
-      <w:r>
-        <w:br w:type="page"/>
-      </w:r>
-    </w:p>
-    <w:p>
-      <w:pPr>
-        <w:spacing w:after="60"/>
-      </w:pPr>
-      <w:r>
-        <w:rPr>
-          <w:b/>
-          <w:bCs/>
-          <w:sz w:val="22"/>
-          <w:szCs w:val="22"/>
-        </w:rPr>
-        <w:t xml:space="preserve">Figure 2</w:t>
-      </w:r>
-    </w:p>
-    <w:p>
-      <w:pPr>
-        <w:spacing w:after="120" w:before="120"/>
-        <w:jc w:val="center"/>
-      </w:pPr>
-      <w:r>
-        <w:drawing>
-          <wp:inline distT="0" distB="0" distL="0" distR="0">
-            <wp:extent cx="5667375" cy="3362325"/>
-            <wp:effectExtent t="0" r="0" b="0" l="0"/>
-            <wp:docPr id="1" name="Fig2.png" descr="Fig2.png" title="Fig2.png"/>
             <wp:cNvGraphicFramePr>
               <a:graphicFrameLocks xmlns:a="http://schemas.openxmlformats.org/drawingml/2006/main" noChangeAspect="1"/>
             </wp:cNvGraphicFramePr>
@@ -3536,6 +3691,71 @@
                   <pic:spPr bwMode="auto">
                     <a:xfrm>
                       <a:off x="0" y="0"/>
+                      <a:ext cx="4210050" cy="2457450"/>
+                    </a:xfrm>
+                    <a:prstGeom prst="rect">
+                      <a:avLst/>
+                    </a:prstGeom>
+                  </pic:spPr>
+                </pic:pic>
+              </a:graphicData>
+            </a:graphic>
+          </wp:inline>
+        </w:drawing>
+      </w:r>
+    </w:p>
+    <w:p>
+      <w:r>
+        <w:br w:type="page"/>
+      </w:r>
+    </w:p>
+    <w:p>
+      <w:pPr>
+        <w:spacing w:after="60"/>
+      </w:pPr>
+      <w:r>
+        <w:rPr>
+          <w:b/>
+          <w:bCs/>
+          <w:sz w:val="22"/>
+          <w:szCs w:val="22"/>
+        </w:rPr>
+        <w:t xml:space="preserve">Figure 2</w:t>
+      </w:r>
+    </w:p>
+    <w:p>
+      <w:pPr>
+        <w:spacing w:after="120" w:before="120"/>
+        <w:jc w:val="center"/>
+      </w:pPr>
+      <w:r>
+        <w:drawing>
+          <wp:inline distT="0" distB="0" distL="0" distR="0">
+            <wp:extent cx="5667375" cy="3362325"/>
+            <wp:effectExtent t="0" r="0" b="0" l="0"/>
+            <wp:docPr id="1" name="Fig2.png" descr="Fig2.png" title="Fig2.png"/>
+            <wp:cNvGraphicFramePr>
+              <a:graphicFrameLocks xmlns:a="http://schemas.openxmlformats.org/drawingml/2006/main" noChangeAspect="1"/>
+            </wp:cNvGraphicFramePr>
+            <a:graphic xmlns:a="http://schemas.openxmlformats.org/drawingml/2006/main">
+              <a:graphicData uri="http://schemas.openxmlformats.org/drawingml/2006/picture">
+                <pic:pic xmlns:pic="http://schemas.openxmlformats.org/drawingml/2006/picture">
+                  <pic:nvPicPr>
+                    <pic:cNvPr id="0" name="" descr=""/>
+                    <pic:cNvPicPr>
+                      <a:picLocks noChangeAspect="1" noChangeArrowheads="1"/>
+                    </pic:cNvPicPr>
+                  </pic:nvPicPr>
+                  <pic:blipFill>
+                    <a:blip r:embed="rId9" cstate="none"/>
+                    <a:srcRect/>
+                    <a:stretch>
+                      <a:fillRect/>
+                    </a:stretch>
+                  </pic:blipFill>
+                  <pic:spPr bwMode="auto">
+                    <a:xfrm>
+                      <a:off x="0" y="0"/>
                       <a:ext cx="5667375" cy="3362325"/>
                     </a:xfrm>
                     <a:prstGeom prst="rect">
@@ -3550,6 +3770,7 @@
       </w:r>
     </w:p>
     <w:sectPr>
+      <w:footerReference w:type="default" r:id="rId7"/>
       <w:pgSz w:w="12240" w:h="15840" w:orient="portrait"/>
       <w:pgMar w:top="1440" w:right="1440" w:bottom="1440" w:left="1440" w:header="708" w:footer="708" w:gutter="0"/>
       <w:pgNumType/>
@@ -3598,6 +3819,26 @@
     </w:p>
   </w:endnote>
 </w:endnotes>
+</file>
+
+<file path=word/footer1.xml><?xml version="1.0" encoding="utf-8"?>
+<w:ftr xmlns:wpc="http://schemas.microsoft.com/office/word/2010/wordprocessingCanvas" xmlns:mc="http://schemas.openxmlformats.org/markup-compatibility/2006" xmlns:o="urn:schemas-microsoft-com:office:office" xmlns:r="http://schemas.openxmlformats.org/officeDocument/2006/relationships" xmlns:m="http://schemas.openxmlformats.org/officeDocument/2006/math" xmlns:v="urn:schemas-microsoft-com:vml" xmlns:wp14="http://schemas.microsoft.com/office/word/2010/wordprocessingDrawing" xmlns:wp="http://schemas.openxmlformats.org/drawingml/2006/wordprocessingDrawing" xmlns:w10="urn:schemas-microsoft-com:office:word" xmlns:w="http://schemas.openxmlformats.org/wordprocessingml/2006/main" xmlns:w14="http://schemas.microsoft.com/office/word/2010/wordml" xmlns:w15="http://schemas.microsoft.com/office/word/2012/wordml" xmlns:wpg="http://schemas.microsoft.com/office/word/2010/wordprocessingGroup" xmlns:wpi="http://schemas.microsoft.com/office/word/2010/wordprocessingInk" xmlns:wne="http://schemas.microsoft.com/office/word/2006/wordml" xmlns:wps="http://schemas.microsoft.com/office/word/2010/wordprocessingShape">
+  <w:p>
+    <w:pPr>
+      <w:jc w:val="center"/>
+    </w:pPr>
+    <w:r>
+      <w:rPr>
+        <w:sz w:val="20"/>
+        <w:szCs w:val="20"/>
+      </w:rPr>
+      <w:fldChar w:fldCharType="begin"/>
+      <w:instrText xml:space="preserve">PAGE</w:instrText>
+      <w:fldChar w:fldCharType="separate"/>
+      <w:fldChar w:fldCharType="end"/>
+    </w:r>
+  </w:p>
+</w:ftr>
 </file>
 
 <file path=word/footnotes.xml><?xml version="1.0" encoding="utf-8"?>

</xml_diff>